<commit_message>
Add authors, repository link and acknowledgment to the research paper
Co-Authored-By: Claude Opus 5.5 <noreply@anthropic.com>
</commit_message>
<xml_diff>
--- a/paper/SEVERANCE_Research_Paper.docx
+++ b/paper/SEVERANCE_Research_Paper.docx
@@ -27,59 +27,13 @@
         <w:rPr>
           <w:sz w:val="22"/>
           <w:szCs w:val="22"/>
-          <w:shd w:fill="FFF59D" w:color="auto" w:val="clear"/>
-        </w:rPr>
-        <w:t xml:space="preserve">[Author Name 1]</w:t>
-      </w:r>
-      <w:r>
-        <w:rPr>
-          <w:sz w:val="22"/>
-          <w:szCs w:val="22"/>
-        </w:rPr>
-        <w:t xml:space="preserve">, </w:t>
-      </w:r>
-      <w:r>
-        <w:rPr>
-          <w:sz w:val="22"/>
-          <w:szCs w:val="22"/>
-          <w:shd w:fill="FFF59D" w:color="auto" w:val="clear"/>
-        </w:rPr>
-        <w:t xml:space="preserve">[Author Name 2]</w:t>
-      </w:r>
-      <w:r>
-        <w:rPr>
-          <w:sz w:val="22"/>
-          <w:szCs w:val="22"/>
-        </w:rPr>
-        <w:t xml:space="preserve">, </w:t>
-      </w:r>
-      <w:r>
-        <w:rPr>
-          <w:sz w:val="22"/>
-          <w:szCs w:val="22"/>
-          <w:shd w:fill="FFF59D" w:color="auto" w:val="clear"/>
-        </w:rPr>
-        <w:t xml:space="preserve">[Author Name 3]</w:t>
-      </w:r>
-      <w:r>
-        <w:rPr>
-          <w:sz w:val="22"/>
-          <w:szCs w:val="22"/>
-        </w:rPr>
-        <w:t xml:space="preserve">, </w:t>
-      </w:r>
-      <w:r>
-        <w:rPr>
-          <w:sz w:val="22"/>
-          <w:szCs w:val="22"/>
-          <w:shd w:fill="FFF59D" w:color="auto" w:val="clear"/>
-        </w:rPr>
-        <w:t xml:space="preserve">[Author Name 4]</w:t>
-      </w:r>
-    </w:p>
-    <w:p>
-      <w:pPr>
-        <w:spacing w:after="40"/>
+        </w:rPr>
+        <w:t xml:space="preserve">Sahil Kumar, Himanshu Singh, Arun Das, Sarthak Vijay, Ujjwal Mishra and Yamuna KK</w:t>
+      </w:r>
+    </w:p>
+    <w:p>
+      <w:pPr>
+        <w:spacing w:after="280"/>
         <w:jc w:val="center"/>
       </w:pPr>
       <w:r>
@@ -89,78 +43,7 @@
           <w:sz w:val="20"/>
           <w:szCs w:val="20"/>
         </w:rPr>
-        <w:t xml:space="preserve">Team Blunder — </w:t>
-      </w:r>
-      <w:r>
-        <w:rPr>
-          <w:i/>
-          <w:iCs/>
-          <w:sz w:val="20"/>
-          <w:szCs w:val="20"/>
-          <w:shd w:fill="FFF59D" w:color="auto" w:val="clear"/>
-        </w:rPr>
-        <w:t xml:space="preserve">[Department]</w:t>
-      </w:r>
-      <w:r>
-        <w:rPr>
-          <w:i/>
-          <w:iCs/>
-          <w:sz w:val="20"/>
-          <w:szCs w:val="20"/>
-        </w:rPr>
-        <w:t xml:space="preserve">, </w:t>
-      </w:r>
-      <w:r>
-        <w:rPr>
-          <w:i/>
-          <w:iCs/>
-          <w:sz w:val="20"/>
-          <w:szCs w:val="20"/>
-          <w:shd w:fill="FFF59D" w:color="auto" w:val="clear"/>
-        </w:rPr>
-        <w:t xml:space="preserve">[Institution]</w:t>
-      </w:r>
-      <w:r>
-        <w:rPr>
-          <w:i/>
-          <w:iCs/>
-          <w:sz w:val="20"/>
-          <w:szCs w:val="20"/>
-        </w:rPr>
-        <w:t xml:space="preserve">, </w:t>
-      </w:r>
-      <w:r>
-        <w:rPr>
-          <w:i/>
-          <w:iCs/>
-          <w:sz w:val="20"/>
-          <w:szCs w:val="20"/>
-          <w:shd w:fill="FFF59D" w:color="auto" w:val="clear"/>
-        </w:rPr>
-        <w:t xml:space="preserve">[City]</w:t>
-      </w:r>
-      <w:r>
-        <w:rPr>
-          <w:i/>
-          <w:iCs/>
-          <w:sz w:val="20"/>
-          <w:szCs w:val="20"/>
-        </w:rPr>
-        <w:t xml:space="preserve">, India</w:t>
-      </w:r>
-    </w:p>
-    <w:p>
-      <w:pPr>
-        <w:spacing w:after="280"/>
-        <w:jc w:val="center"/>
-      </w:pPr>
-      <w:r>
-        <w:rPr>
-          <w:sz w:val="20"/>
-          <w:szCs w:val="20"/>
-          <w:shd w:fill="FFF59D" w:color="auto" w:val="clear"/>
-        </w:rPr>
-        <w:t xml:space="preserve">[corresponding-author@institution.ac.in]</w:t>
+        <w:t xml:space="preserve">Team Blunder, India</w:t>
       </w:r>
     </w:p>
     <w:p>
@@ -1309,16 +1192,7 @@
         <w:t xml:space="preserve">granite3.2-vision</w:t>
       </w:r>
       <w:r>
-        <w:t xml:space="preserve"> (vision). The corpus has four documents, 82 pages and 137,650 characters. Seventy-six pages are a real public regulation: the Petroleum and Natural Gas Regulatory Board's Codes of Practices for Emergency Response and Disaster Management Plan (ERDMP) Regulations, 2010 [26], containing amendment markers, tables, checklists and forms. The remaining three documents are short synthetic documents (six pages in total) standing in for internal HSE, vigilance and RTI records; they carry different tiers and compartments so that the access model can be exercised. No real confidential documents were used. Experiments E1–E4 are deterministic and involve no model; E5 and E6 use the live models. Scripts and raw outputs are available from the authors </w:t>
-      </w:r>
-      <w:r>
-        <w:rPr>
-          <w:shd w:fill="FFF59D" w:color="auto" w:val="clear"/>
-        </w:rPr>
-        <w:t xml:space="preserve">[repository link]</w:t>
-      </w:r>
-      <w:r>
-        <w:t xml:space="preserve">.</w:t>
+        <w:t xml:space="preserve"> (vision). The corpus has four documents, 82 pages and 137,650 characters. Seventy-six pages are a real public regulation: the Petroleum and Natural Gas Regulatory Board's Codes of Practices for Emergency Response and Disaster Management Plan (ERDMP) Regulations, 2010 [26], containing amendment markers, tables, checklists and forms. The remaining three documents are short synthetic documents (six pages in total) standing in for internal HSE, vigilance and RTI records; they carry different tiers and compartments so that the access model can be exercised. No real confidential documents were used. Experiments E1–E4 are deterministic and involve no model; E5 and E6 use the live models. The source code, evaluation scripts and raw outputs are available at https://github.com/sahilsea/SEVERANCE.git.</w:t>
       </w:r>
     </w:p>
     <w:p>
@@ -11288,10 +11162,7 @@
         <w:jc w:val="both"/>
       </w:pPr>
       <w:r>
-        <w:rPr>
-          <w:shd w:fill="FFF59D" w:color="auto" w:val="clear"/>
-        </w:rPr>
-        <w:t xml:space="preserve">[Optional: acknowledge mentors, institution and the Smart India Hackathon problem-statement owner.]</w:t>
+        <w:t xml:space="preserve">The authors thank Mangalore Refinery and Petrochemicals Limited (MRPL) for posing, through the Smart India Hackathon, the problem statement that motivated this work.</w:t>
       </w:r>
     </w:p>
     <w:p>

</xml_diff>